<commit_message>
docs:actualizacion de carpeta docx/
</commit_message>
<xml_diff>
--- a/docx/guides/modules/04_estructura_escolar/submodules/gestion_jornadas.docx
+++ b/docx/guides/modules/04_estructura_escolar/submodules/gestion_jornadas.docx
@@ -2,13 +2,13 @@
 <file path=word/document.xml><?xml version="1.0" encoding="utf-8"?>
 <w:document xmlns:w="http://schemas.openxmlformats.org/wordprocessingml/2006/main" xmlns:m="http://schemas.openxmlformats.org/officeDocument/2006/math" xmlns:r="http://schemas.openxmlformats.org/officeDocument/2006/relationships" xmlns:o="urn:schemas-microsoft-com:office:office" xmlns:v="urn:schemas-microsoft-com:vml" xmlns:w10="urn:schemas-microsoft-com:office:word" xmlns:a="http://schemas.openxmlformats.org/drawingml/2006/main" xmlns:pic="http://schemas.openxmlformats.org/drawingml/2006/picture" xmlns:wp="http://schemas.openxmlformats.org/drawingml/2006/wordprocessingDrawing">
   <w:body>
-    <w:bookmarkStart w:id="20" w:name="X3553fc5ca90ea3a57dc00e84a3740500aebb758"/>
+    <w:bookmarkStart w:id="18" w:name="X26ffa839b0ea31ec5b46449fbafdf6773f99738"/>
     <w:p>
       <w:pPr>
         <w:pStyle w:val="Heading1"/>
       </w:pPr>
       <w:r>
-        <w:t xml:space="preserve">🌅 Sub-Módulo: Gestión y Análisis de Jornadas Escolares</w:t>
+        <w:t xml:space="preserve">🌅 Sub-Módulo 04.1 — Gestión de Jornadas Institucionales</w:t>
       </w:r>
     </w:p>
     <w:p>
@@ -20,14 +20,19 @@
           <w:b/>
           <w:bCs/>
         </w:rPr>
-        <w:t xml:space="preserve">Sistema:</w:t>
-      </w:r>
-      <w:r>
-        <w:t xml:space="preserve"> </w:t>
-      </w:r>
-      <w:r>
-        <w:t xml:space="preserve">Academia Neiva</w:t>
-      </w:r>
+        <w:t xml:space="preserve">Módulo Principal:</w:t>
+      </w:r>
+      <w:r>
+        <w:t xml:space="preserve"> </w:t>
+      </w:r>
+      <w:hyperlink r:id="rId9">
+        <w:r>
+          <w:rPr>
+            <w:rStyle w:val="Hyperlink"/>
+          </w:rPr>
+          <w:t xml:space="preserve">04 — Estructura Escolar</w:t>
+        </w:r>
+      </w:hyperlink>
       <w:r>
         <w:br/>
       </w:r>
@@ -36,13 +41,13 @@
           <w:b/>
           <w:bCs/>
         </w:rPr>
-        <w:t xml:space="preserve">Módulo Padre:</w:t>
-      </w:r>
-      <w:r>
-        <w:t xml:space="preserve"> </w:t>
-      </w:r>
-      <w:r>
-        <w:t xml:space="preserve">04 — Estructura Escolar</w:t>
+        <w:t xml:space="preserve">Sistema:</w:t>
+      </w:r>
+      <w:r>
+        <w:t xml:space="preserve"> </w:t>
+      </w:r>
+      <w:r>
+        <w:t xml:space="preserve">Academia Neiva</w:t>
       </w:r>
       <w:r>
         <w:br/>
@@ -52,29 +57,13 @@
           <w:b/>
           <w:bCs/>
         </w:rPr>
-        <w:t xml:space="preserve">Sub-módulo:</w:t>
-      </w:r>
-      <w:r>
-        <w:t xml:space="preserve"> </w:t>
-      </w:r>
-      <w:r>
-        <w:t xml:space="preserve">04.1 — Gestión de Jornadas Institucionales</w:t>
-      </w:r>
-      <w:r>
-        <w:br/>
-      </w:r>
-      <w:r>
-        <w:rPr>
-          <w:b/>
-          <w:bCs/>
-        </w:rPr>
         <w:t xml:space="preserve">Última actualización:</w:t>
       </w:r>
       <w:r>
         <w:t xml:space="preserve"> </w:t>
       </w:r>
       <w:r>
-        <w:t xml:space="preserve">2026-08-14</w:t>
+        <w:t xml:space="preserve">2026-08-17</w:t>
       </w:r>
     </w:p>
     <w:p>
@@ -84,7 +73,7 @@
         </w:pict>
       </w:r>
     </w:p>
-    <w:bookmarkStart w:id="9" w:name="descripción-funcional"/>
+    <w:bookmarkStart w:id="10" w:name="descripción-funcional"/>
     <w:p>
       <w:pPr>
         <w:pStyle w:val="Heading2"/>
@@ -108,44 +97,31 @@
           <w:b/>
           <w:bCs/>
         </w:rPr>
-        <w:t xml:space="preserve">Gestión y Análisis de Jornadas Escolares</w:t>
-      </w:r>
-      <w:r>
-        <w:t xml:space="preserve"> </w:t>
-      </w:r>
-      <w:r>
-        <w:t xml:space="preserve">opera de forma integrada dentro de la vista de</w:t>
-      </w:r>
-      <w:r>
-        <w:t xml:space="preserve"> </w:t>
-      </w:r>
-      <w:r>
-        <w:rPr>
-          <w:i/>
-          <w:iCs/>
-        </w:rPr>
-        <w:t xml:space="preserve">Estructura Académica</w:t>
-      </w:r>
-      <w:r>
-        <w:t xml:space="preserve"> </w:t>
-      </w:r>
-      <w:r>
-        <w:t xml:space="preserve">(</w:t>
+        <w:t xml:space="preserve">Gestión de Jornadas</w:t>
+      </w:r>
+      <w:r>
+        <w:t xml:space="preserve"> </w:t>
+      </w:r>
+      <w:r>
+        <w:t xml:space="preserve">regula los turnos operativos de cada colegio (</w:t>
       </w:r>
       <w:r>
         <w:rPr>
           <w:rStyle w:val="VerbatimChar"/>
         </w:rPr>
-        <w:t xml:space="preserve">GradeManagement.vue</w:t>
-      </w:r>
-      <w:r>
-        <w:t xml:space="preserve">). Permite al equipo directivo supervisar, habilitar y administrar las jornadas académicas operativas del plantel educativo (</w:t>
+        <w:t xml:space="preserve">MAÑANA</w:t>
+      </w:r>
+      <w:r>
+        <w:t xml:space="preserve">,</w:t>
+      </w:r>
+      <w:r>
+        <w:t xml:space="preserve"> </w:t>
       </w:r>
       <w:r>
         <w:rPr>
           <w:rStyle w:val="VerbatimChar"/>
         </w:rPr>
-        <w:t xml:space="preserve">MAÑANA</w:t>
+        <w:t xml:space="preserve">TARDE</w:t>
       </w:r>
       <w:r>
         <w:t xml:space="preserve">,</w:t>
@@ -157,7 +133,7 @@
         <w:rPr>
           <w:rStyle w:val="VerbatimChar"/>
         </w:rPr>
-        <w:t xml:space="preserve">TARDE</w:t>
+        <w:t xml:space="preserve">UNICA</w:t>
       </w:r>
       <w:r>
         <w:t xml:space="preserve">,</w:t>
@@ -169,22 +145,19 @@
         <w:rPr>
           <w:rStyle w:val="VerbatimChar"/>
         </w:rPr>
-        <w:t xml:space="preserve">UNICA</w:t>
-      </w:r>
-      <w:r>
-        <w:t xml:space="preserve">,</w:t>
-      </w:r>
-      <w:r>
-        <w:t xml:space="preserve"> </w:t>
+        <w:t xml:space="preserve">NOCTURNA</w:t>
+      </w:r>
+      <w:r>
+        <w:t xml:space="preserve">). Cada curso físico (</w:t>
       </w:r>
       <w:r>
         <w:rPr>
           <w:rStyle w:val="VerbatimChar"/>
         </w:rPr>
-        <w:t xml:space="preserve">NOCTURNA</w:t>
-      </w:r>
-      <w:r>
-        <w:t xml:space="preserve">), evaluar la ocupación de aforos en tiempo real, visualizar la cobertura de grados por turno y reasignar cursos entre jornadas sin alterar el historial ni los registros de matrícula.</w:t>
+        <w:t xml:space="preserve">grupos</w:t>
+      </w:r>
+      <w:r>
+        <w:t xml:space="preserve">) pertenece a una jornada específica, permitiendo organizar los horarios de clase, aforos de planta física y asignaciones docentes.</w:t>
       </w:r>
     </w:p>
     <w:p>
@@ -194,14 +167,468 @@
         </w:pict>
       </w:r>
     </w:p>
-    <w:bookmarkEnd w:id="9"/>
-    <w:bookmarkStart w:id="10" w:name="actores-y-permisos"/>
+    <w:bookmarkEnd w:id="10"/>
+    <w:bookmarkStart w:id="16" w:name="reglas-de-negocio-del-sub-módulo"/>
     <w:p>
       <w:pPr>
         <w:pStyle w:val="Heading2"/>
       </w:pPr>
       <w:r>
-        <w:t xml:space="preserve">2. Actores y Permisos</w:t>
+        <w:t xml:space="preserve">2. Reglas de Negocio del Sub-Módulo</w:t>
+      </w:r>
+    </w:p>
+    <w:bookmarkStart w:id="12" w:name="Xf7ecf2ff7ac02228c337ca6307aade61874cfd1"/>
+    <w:p>
+      <w:pPr>
+        <w:pStyle w:val="Heading3"/>
+      </w:pPr>
+      <w:r>
+        <w:t xml:space="preserve">RN-JOR-001: Catálogo Oficial de Turnos Escolares</w:t>
+      </w:r>
+    </w:p>
+    <w:p>
+      <w:pPr>
+        <w:pStyle w:val="Compact"/>
+        <w:numPr>
+          <w:ilvl w:val="0"/>
+          <w:numId w:val="1001"/>
+        </w:numPr>
+      </w:pPr>
+      <w:r>
+        <w:rPr>
+          <w:b/>
+          <w:bCs/>
+        </w:rPr>
+        <w:t xml:space="preserve">Descripción:</w:t>
+      </w:r>
+      <w:r>
+        <w:t xml:space="preserve"> </w:t>
+      </w:r>
+      <w:r>
+        <w:t xml:space="preserve">Solo se permite habilitar las cuatro jornadas oficiales del sistema:</w:t>
+      </w:r>
+      <w:r>
+        <w:t xml:space="preserve"> </w:t>
+      </w:r>
+      <w:r>
+        <w:rPr>
+          <w:rStyle w:val="VerbatimChar"/>
+        </w:rPr>
+        <w:t xml:space="preserve">MAÑANA</w:t>
+      </w:r>
+      <w:r>
+        <w:t xml:space="preserve">,</w:t>
+      </w:r>
+      <w:r>
+        <w:t xml:space="preserve"> </w:t>
+      </w:r>
+      <w:r>
+        <w:rPr>
+          <w:rStyle w:val="VerbatimChar"/>
+        </w:rPr>
+        <w:t xml:space="preserve">TARDE</w:t>
+      </w:r>
+      <w:r>
+        <w:t xml:space="preserve">,</w:t>
+      </w:r>
+      <w:r>
+        <w:t xml:space="preserve"> </w:t>
+      </w:r>
+      <w:r>
+        <w:rPr>
+          <w:rStyle w:val="VerbatimChar"/>
+        </w:rPr>
+        <w:t xml:space="preserve">UNICA</w:t>
+      </w:r>
+      <w:r>
+        <w:t xml:space="preserve"> </w:t>
+      </w:r>
+      <w:r>
+        <w:t xml:space="preserve">y</w:t>
+      </w:r>
+      <w:r>
+        <w:t xml:space="preserve"> </w:t>
+      </w:r>
+      <w:r>
+        <w:rPr>
+          <w:rStyle w:val="VerbatimChar"/>
+        </w:rPr>
+        <w:t xml:space="preserve">NOCTURNA</w:t>
+      </w:r>
+      <w:r>
+        <w:t xml:space="preserve">.</w:t>
+      </w:r>
+    </w:p>
+    <w:p>
+      <w:pPr>
+        <w:pStyle w:val="Compact"/>
+        <w:numPr>
+          <w:ilvl w:val="0"/>
+          <w:numId w:val="1001"/>
+        </w:numPr>
+      </w:pPr>
+      <w:r>
+        <w:rPr>
+          <w:b/>
+          <w:bCs/>
+        </w:rPr>
+        <w:t xml:space="preserve">Implementación:</w:t>
+      </w:r>
+      <w:r>
+        <w:t xml:space="preserve"> </w:t>
+      </w:r>
+      <w:hyperlink r:id="rId11">
+        <w:r>
+          <w:rPr>
+            <w:rStyle w:val="Hyperlink"/>
+          </w:rPr>
+          <w:t xml:space="preserve">gradeGroupController.ts</w:t>
+        </w:r>
+      </w:hyperlink>
+      <w:r>
+        <w:t xml:space="preserve"> </w:t>
+      </w:r>
+      <w:r>
+        <w:t xml:space="preserve">(</w:t>
+      </w:r>
+      <w:r>
+        <w:rPr>
+          <w:rStyle w:val="VerbatimChar"/>
+        </w:rPr>
+        <w:t xml:space="preserve">createJornada</w:t>
+      </w:r>
+      <w:r>
+        <w:t xml:space="preserve">).</w:t>
+      </w:r>
+    </w:p>
+    <w:p>
+      <w:r>
+        <w:pict>
+          <v:rect style="width:0;height:1.5pt" o:hralign="center" o:hrstd="t" o:hr="t"/>
+        </w:pict>
+      </w:r>
+    </w:p>
+    <w:bookmarkEnd w:id="12"/>
+    <w:bookmarkStart w:id="13" w:name="X9ba83d4a272b50c265bcf1a0833cf3606c69e77"/>
+    <w:p>
+      <w:pPr>
+        <w:pStyle w:val="Heading3"/>
+      </w:pPr>
+      <w:r>
+        <w:t xml:space="preserve">RN-JOR-002: Unicidad de Jornada por Institución</w:t>
+      </w:r>
+    </w:p>
+    <w:p>
+      <w:pPr>
+        <w:pStyle w:val="Compact"/>
+        <w:numPr>
+          <w:ilvl w:val="0"/>
+          <w:numId w:val="1002"/>
+        </w:numPr>
+      </w:pPr>
+      <w:r>
+        <w:rPr>
+          <w:b/>
+          <w:bCs/>
+        </w:rPr>
+        <w:t xml:space="preserve">Descripción:</w:t>
+      </w:r>
+      <w:r>
+        <w:t xml:space="preserve"> </w:t>
+      </w:r>
+      <w:r>
+        <w:t xml:space="preserve">Una institución no puede tener dos jornadas registradas con el mismo nombre. El intento de duplicación responde con error</w:t>
+      </w:r>
+      <w:r>
+        <w:t xml:space="preserve"> </w:t>
+      </w:r>
+      <w:r>
+        <w:rPr>
+          <w:rStyle w:val="VerbatimChar"/>
+        </w:rPr>
+        <w:t xml:space="preserve">409 Conflict</w:t>
+      </w:r>
+      <w:r>
+        <w:t xml:space="preserve">.</w:t>
+      </w:r>
+    </w:p>
+    <w:p>
+      <w:pPr>
+        <w:pStyle w:val="Compact"/>
+        <w:numPr>
+          <w:ilvl w:val="0"/>
+          <w:numId w:val="1002"/>
+        </w:numPr>
+      </w:pPr>
+      <w:r>
+        <w:rPr>
+          <w:b/>
+          <w:bCs/>
+        </w:rPr>
+        <w:t xml:space="preserve">Implementación:</w:t>
+      </w:r>
+      <w:r>
+        <w:t xml:space="preserve"> </w:t>
+      </w:r>
+      <w:hyperlink r:id="rId11">
+        <w:r>
+          <w:rPr>
+            <w:rStyle w:val="Hyperlink"/>
+          </w:rPr>
+          <w:t xml:space="preserve">gradeGroupController.ts</w:t>
+        </w:r>
+      </w:hyperlink>
+      <w:r>
+        <w:t xml:space="preserve"> </w:t>
+      </w:r>
+      <w:r>
+        <w:t xml:space="preserve">(</w:t>
+      </w:r>
+      <w:r>
+        <w:rPr>
+          <w:rStyle w:val="VerbatimChar"/>
+        </w:rPr>
+        <w:t xml:space="preserve">createJornada</w:t>
+      </w:r>
+      <w:r>
+        <w:t xml:space="preserve">).</w:t>
+      </w:r>
+    </w:p>
+    <w:p>
+      <w:r>
+        <w:pict>
+          <v:rect style="width:0;height:1.5pt" o:hralign="center" o:hrstd="t" o:hr="t"/>
+        </w:pict>
+      </w:r>
+    </w:p>
+    <w:bookmarkEnd w:id="13"/>
+    <w:bookmarkStart w:id="14" w:name="X02eeed306891464a55665490dd9f66131f82769"/>
+    <w:p>
+      <w:pPr>
+        <w:pStyle w:val="Heading3"/>
+      </w:pPr>
+      <w:r>
+        <w:t xml:space="preserve">RN-JOR-003: Eliminación Restringida de Jornadas</w:t>
+      </w:r>
+    </w:p>
+    <w:p>
+      <w:pPr>
+        <w:pStyle w:val="Compact"/>
+        <w:numPr>
+          <w:ilvl w:val="0"/>
+          <w:numId w:val="1003"/>
+        </w:numPr>
+      </w:pPr>
+      <w:r>
+        <w:rPr>
+          <w:b/>
+          <w:bCs/>
+        </w:rPr>
+        <w:t xml:space="preserve">Descripción:</w:t>
+      </w:r>
+      <w:r>
+        <w:t xml:space="preserve"> </w:t>
+      </w:r>
+      <w:r>
+        <w:t xml:space="preserve">Una jornada no puede eliminarse (</w:t>
+      </w:r>
+      <w:r>
+        <w:rPr>
+          <w:rStyle w:val="VerbatimChar"/>
+        </w:rPr>
+        <w:t xml:space="preserve">deleteJornada</w:t>
+      </w:r>
+      <w:r>
+        <w:t xml:space="preserve">) si cuenta con al menos un curso físico asociado en la tabla</w:t>
+      </w:r>
+      <w:r>
+        <w:t xml:space="preserve"> </w:t>
+      </w:r>
+      <w:r>
+        <w:rPr>
+          <w:rStyle w:val="VerbatimChar"/>
+        </w:rPr>
+        <w:t xml:space="preserve">grupos</w:t>
+      </w:r>
+      <w:r>
+        <w:t xml:space="preserve">. El directivo debe reasignar o eliminar los cursos antes de retirar la jornada (</w:t>
+      </w:r>
+      <w:r>
+        <w:rPr>
+          <w:rStyle w:val="VerbatimChar"/>
+        </w:rPr>
+        <w:t xml:space="preserve">409 Conflict</w:t>
+      </w:r>
+      <w:r>
+        <w:t xml:space="preserve">).</w:t>
+      </w:r>
+    </w:p>
+    <w:p>
+      <w:pPr>
+        <w:pStyle w:val="Compact"/>
+        <w:numPr>
+          <w:ilvl w:val="0"/>
+          <w:numId w:val="1003"/>
+        </w:numPr>
+      </w:pPr>
+      <w:r>
+        <w:rPr>
+          <w:b/>
+          <w:bCs/>
+        </w:rPr>
+        <w:t xml:space="preserve">Implementación:</w:t>
+      </w:r>
+      <w:r>
+        <w:t xml:space="preserve"> </w:t>
+      </w:r>
+      <w:hyperlink r:id="rId11">
+        <w:r>
+          <w:rPr>
+            <w:rStyle w:val="Hyperlink"/>
+          </w:rPr>
+          <w:t xml:space="preserve">gradeGroupController.ts</w:t>
+        </w:r>
+      </w:hyperlink>
+      <w:r>
+        <w:t xml:space="preserve"> </w:t>
+      </w:r>
+      <w:r>
+        <w:t xml:space="preserve">(</w:t>
+      </w:r>
+      <w:r>
+        <w:rPr>
+          <w:rStyle w:val="VerbatimChar"/>
+        </w:rPr>
+        <w:t xml:space="preserve">deleteJornada</w:t>
+      </w:r>
+      <w:r>
+        <w:t xml:space="preserve">).</w:t>
+      </w:r>
+    </w:p>
+    <w:p>
+      <w:r>
+        <w:pict>
+          <v:rect style="width:0;height:1.5pt" o:hralign="center" o:hrstd="t" o:hr="t"/>
+        </w:pict>
+      </w:r>
+    </w:p>
+    <w:bookmarkEnd w:id="14"/>
+    <w:bookmarkStart w:id="15" w:name="X630a41873a0a5fedc391a4e3758ddca189a2474"/>
+    <w:p>
+      <w:pPr>
+        <w:pStyle w:val="Heading3"/>
+      </w:pPr>
+      <w:r>
+        <w:t xml:space="preserve">RN-JOR-004: Guarda Institucional de Reasignación de Cursos entre Jornadas</w:t>
+      </w:r>
+    </w:p>
+    <w:p>
+      <w:pPr>
+        <w:pStyle w:val="Compact"/>
+        <w:numPr>
+          <w:ilvl w:val="0"/>
+          <w:numId w:val="1004"/>
+        </w:numPr>
+      </w:pPr>
+      <w:r>
+        <w:rPr>
+          <w:b/>
+          <w:bCs/>
+        </w:rPr>
+        <w:t xml:space="preserve">Descripción:</w:t>
+      </w:r>
+      <w:r>
+        <w:t xml:space="preserve"> </w:t>
+      </w:r>
+      <w:r>
+        <w:t xml:space="preserve">La reasignación de cursos entre jornadas (</w:t>
+      </w:r>
+      <w:r>
+        <w:rPr>
+          <w:rStyle w:val="VerbatimChar"/>
+        </w:rPr>
+        <w:t xml:space="preserve">reassignGroupJornada</w:t>
+      </w:r>
+      <w:r>
+        <w:t xml:space="preserve">) se encuentra controlada por la guarda de política institucional (</w:t>
+      </w:r>
+      <w:r>
+        <w:rPr>
+          <w:rStyle w:val="VerbatimChar"/>
+        </w:rPr>
+        <w:t xml:space="preserve">IS_JORNADA_REASSIGNMENT_ENABLED = false</w:t>
+      </w:r>
+      <w:r>
+        <w:t xml:space="preserve">). Esta guarda protege las jornadas seleccionadas por los padres de familia durante el proceso oficial de matrícula. Cuando se activa mediante autorización rectoral, valida que no exista un curso con el mismo grado y sección en la jornada de destino (</w:t>
+      </w:r>
+      <w:r>
+        <w:rPr>
+          <w:rStyle w:val="VerbatimChar"/>
+        </w:rPr>
+        <w:t xml:space="preserve">409 Conflict</w:t>
+      </w:r>
+      <w:r>
+        <w:t xml:space="preserve">).</w:t>
+      </w:r>
+    </w:p>
+    <w:p>
+      <w:pPr>
+        <w:pStyle w:val="Compact"/>
+        <w:numPr>
+          <w:ilvl w:val="0"/>
+          <w:numId w:val="1004"/>
+        </w:numPr>
+      </w:pPr>
+      <w:r>
+        <w:rPr>
+          <w:b/>
+          <w:bCs/>
+        </w:rPr>
+        <w:t xml:space="preserve">Implementación:</w:t>
+      </w:r>
+      <w:r>
+        <w:t xml:space="preserve"> </w:t>
+      </w:r>
+      <w:hyperlink r:id="rId11">
+        <w:r>
+          <w:rPr>
+            <w:rStyle w:val="Hyperlink"/>
+          </w:rPr>
+          <w:t xml:space="preserve">gradeGroupController.ts</w:t>
+        </w:r>
+      </w:hyperlink>
+      <w:r>
+        <w:t xml:space="preserve"> </w:t>
+      </w:r>
+      <w:r>
+        <w:t xml:space="preserve">(</w:t>
+      </w:r>
+      <w:r>
+        <w:rPr>
+          <w:rStyle w:val="VerbatimChar"/>
+        </w:rPr>
+        <w:t xml:space="preserve">reassignGroupJornada</w:t>
+      </w:r>
+      <w:r>
+        <w:t xml:space="preserve">).</w:t>
+      </w:r>
+    </w:p>
+    <w:p>
+      <w:r>
+        <w:pict>
+          <v:rect style="width:0;height:1.5pt" o:hralign="center" o:hrstd="t" o:hr="t"/>
+        </w:pict>
+      </w:r>
+    </w:p>
+    <w:bookmarkEnd w:id="15"/>
+    <w:bookmarkEnd w:id="16"/>
+    <w:bookmarkStart w:id="17" w:name="endpoints-del-sub-módulo"/>
+    <w:p>
+      <w:pPr>
+        <w:pStyle w:val="Heading2"/>
+      </w:pPr>
+      <w:r>
+        <w:t xml:space="preserve">3. Endpoints del Sub-Módulo</w:t>
       </w:r>
     </w:p>
     <w:tbl>
@@ -212,139 +639,14 @@
         <w:tblLook w:firstRow="1" w:lastRow="0" w:firstColumn="0" w:lastColumn="0" w:noHBand="0" w:noVBand="0" w:val="0020"/>
       </w:tblPr>
       <w:tblGrid>
-        <w:gridCol w:w="3960"/>
-        <w:gridCol w:w="3960"/>
+        <w:gridCol w:w="2640"/>
+        <w:gridCol w:w="2640"/>
+        <w:gridCol w:w="2640"/>
       </w:tblGrid>
       <w:tr>
         <w:trPr>
           <w:tblHeader w:val="on"/>
         </w:trPr>
-        <w:tc>
-          <w:tcPr/>
-          <w:p>
-            <w:pPr>
-              <w:pStyle w:val="Compact"/>
-            </w:pPr>
-            <w:r>
-              <w:t xml:space="preserve">Rol</w:t>
-            </w:r>
-          </w:p>
-        </w:tc>
-        <w:tc>
-          <w:tcPr/>
-          <w:p>
-            <w:pPr>
-              <w:pStyle w:val="Compact"/>
-            </w:pPr>
-            <w:r>
-              <w:t xml:space="preserve">Permisos y Alcance</w:t>
-            </w:r>
-          </w:p>
-        </w:tc>
-      </w:tr>
-      <w:tr>
-        <w:tc>
-          <w:tcPr/>
-          <w:p>
-            <w:pPr>
-              <w:pStyle w:val="Compact"/>
-            </w:pPr>
-            <w:r>
-              <w:rPr>
-                <w:b/>
-                <w:bCs/>
-              </w:rPr>
-              <w:t xml:space="preserve">Directivo / Rector</w:t>
-            </w:r>
-          </w:p>
-        </w:tc>
-        <w:tc>
-          <w:tcPr/>
-          <w:p>
-            <w:pPr>
-              <w:pStyle w:val="Compact"/>
-            </w:pPr>
-            <w:r>
-              <w:t xml:space="preserve">Habilitar nuevas jornadas, retirar jornadas sin cursos, reasignar salones de jornada y auditar el aforo y ocupación.</w:t>
-            </w:r>
-          </w:p>
-        </w:tc>
-      </w:tr>
-      <w:tr>
-        <w:tc>
-          <w:tcPr/>
-          <w:p>
-            <w:pPr>
-              <w:pStyle w:val="Compact"/>
-            </w:pPr>
-            <w:r>
-              <w:rPr>
-                <w:b/>
-                <w:bCs/>
-              </w:rPr>
-              <w:t xml:space="preserve">Admin General</w:t>
-            </w:r>
-          </w:p>
-        </w:tc>
-        <w:tc>
-          <w:tcPr/>
-          <w:p>
-            <w:pPr>
-              <w:pStyle w:val="Compact"/>
-            </w:pPr>
-            <w:r>
-              <w:t xml:space="preserve">Supervisión multi-sede de jornadas configuradas y balance de cobertura institucional.</w:t>
-            </w:r>
-          </w:p>
-        </w:tc>
-      </w:tr>
-    </w:tbl>
-    <w:p>
-      <w:r>
-        <w:pict>
-          <v:rect style="width:0;height:1.5pt" o:hralign="center" o:hrstd="t" o:hr="t"/>
-        </w:pict>
-      </w:r>
-    </w:p>
-    <w:bookmarkEnd w:id="10"/>
-    <w:bookmarkStart w:id="11" w:name="acciones-y-endpoints-api"/>
-    <w:p>
-      <w:pPr>
-        <w:pStyle w:val="Heading2"/>
-      </w:pPr>
-      <w:r>
-        <w:t xml:space="preserve">3. Acciones y Endpoints API</w:t>
-      </w:r>
-    </w:p>
-    <w:tbl>
-      <w:tblPr>
-        <w:tblStyle w:val="Table"/>
-        <w:tblW w:type="pct" w:w="5000"/>
-        <w:tblLayout w:type="fixed"/>
-        <w:tblLook w:firstRow="1" w:lastRow="0" w:firstColumn="0" w:lastColumn="0" w:noHBand="0" w:noVBand="0" w:val="0020"/>
-      </w:tblPr>
-      <w:tblGrid>
-        <w:gridCol w:w="1584"/>
-        <w:gridCol w:w="1584"/>
-        <w:gridCol w:w="1584"/>
-        <w:gridCol w:w="1584"/>
-        <w:gridCol w:w="1584"/>
-      </w:tblGrid>
-      <w:tr>
-        <w:trPr>
-          <w:tblHeader w:val="on"/>
-        </w:trPr>
-        <w:tc>
-          <w:tcPr/>
-          <w:p>
-            <w:pPr>
-              <w:pStyle w:val="Compact"/>
-            </w:pPr>
-            <w:r>
-              <w:t xml:space="preserve">Acción</w:t>
-            </w:r>
-          </w:p>
-        </w:tc>
         <w:tc>
           <w:tcPr/>
           <w:p>
@@ -374,105 +676,12 @@
               <w:pStyle w:val="Compact"/>
             </w:pPr>
             <w:r>
-              <w:t xml:space="preserve">Rol Requerido</w:t>
-            </w:r>
-          </w:p>
-        </w:tc>
-        <w:tc>
-          <w:tcPr/>
-          <w:p>
-            <w:pPr>
-              <w:pStyle w:val="Compact"/>
-            </w:pPr>
-            <w:r>
-              <w:t xml:space="preserve">Descripción</w:t>
+              <w:t xml:space="preserve">Acción</w:t>
             </w:r>
           </w:p>
         </w:tc>
       </w:tr>
       <w:tr>
-        <w:tc>
-          <w:tcPr/>
-          <w:p>
-            <w:pPr>
-              <w:pStyle w:val="Compact"/>
-            </w:pPr>
-            <w:r>
-              <w:rPr>
-                <w:b/>
-                <w:bCs/>
-              </w:rPr>
-              <w:t xml:space="preserve">Consultar Estructura y Jornadas</w:t>
-            </w:r>
-          </w:p>
-        </w:tc>
-        <w:tc>
-          <w:tcPr/>
-          <w:p>
-            <w:pPr>
-              <w:pStyle w:val="Compact"/>
-            </w:pPr>
-            <w:r>
-              <w:rPr>
-                <w:rStyle w:val="VerbatimChar"/>
-              </w:rPr>
-              <w:t xml:space="preserve">GET</w:t>
-            </w:r>
-          </w:p>
-        </w:tc>
-        <w:tc>
-          <w:tcPr/>
-          <w:p>
-            <w:pPr>
-              <w:pStyle w:val="Compact"/>
-            </w:pPr>
-            <w:r>
-              <w:rPr>
-                <w:rStyle w:val="VerbatimChar"/>
-              </w:rPr>
-              <w:t xml:space="preserve">/api/academic-admin/grades/:schoolId</w:t>
-            </w:r>
-          </w:p>
-        </w:tc>
-        <w:tc>
-          <w:tcPr/>
-          <w:p>
-            <w:pPr>
-              <w:pStyle w:val="Compact"/>
-            </w:pPr>
-            <w:r>
-              <w:t xml:space="preserve">Directivo / Admin General</w:t>
-            </w:r>
-          </w:p>
-        </w:tc>
-        <w:tc>
-          <w:tcPr/>
-          <w:p>
-            <w:pPr>
-              <w:pStyle w:val="Compact"/>
-            </w:pPr>
-            <w:r>
-              <w:t xml:space="preserve">Obtiene jornadas, niveles, grados, grupos y aforos del año lectivo seleccionado.</w:t>
-            </w:r>
-          </w:p>
-        </w:tc>
-      </w:tr>
-      <w:tr>
-        <w:tc>
-          <w:tcPr/>
-          <w:p>
-            <w:pPr>
-              <w:pStyle w:val="Compact"/>
-            </w:pPr>
-            <w:r>
-              <w:rPr>
-                <w:b/>
-                <w:bCs/>
-              </w:rPr>
-              <w:t xml:space="preserve">Habilitar Nueva Jornada</w:t>
-            </w:r>
-          </w:p>
-        </w:tc>
         <w:tc>
           <w:tcPr/>
           <w:p>
@@ -508,83 +717,21 @@
               <w:pStyle w:val="Compact"/>
             </w:pPr>
             <w:r>
-              <w:t xml:space="preserve">Directivo</w:t>
-            </w:r>
-          </w:p>
-        </w:tc>
-        <w:tc>
-          <w:tcPr/>
-          <w:p>
-            <w:pPr>
-              <w:pStyle w:val="Compact"/>
-            </w:pPr>
-            <w:r>
-              <w:t xml:space="preserve">Registra una jornada institucional válida (</w:t>
+              <w:t xml:space="preserve">Habilitar nueva jornada institucional (</w:t>
             </w:r>
             <w:r>
               <w:rPr>
                 <w:rStyle w:val="VerbatimChar"/>
               </w:rPr>
-              <w:t xml:space="preserve">MAÑANA</w:t>
+              <w:t xml:space="preserve">createJornada</w:t>
             </w:r>
             <w:r>
-              <w:t xml:space="preserve">,</w:t>
-            </w:r>
-            <w:r>
-              <w:t xml:space="preserve"> </w:t>
-            </w:r>
-            <w:r>
-              <w:rPr>
-                <w:rStyle w:val="VerbatimChar"/>
-              </w:rPr>
-              <w:t xml:space="preserve">TARDE</w:t>
-            </w:r>
-            <w:r>
-              <w:t xml:space="preserve">,</w:t>
-            </w:r>
-            <w:r>
-              <w:t xml:space="preserve"> </w:t>
-            </w:r>
-            <w:r>
-              <w:rPr>
-                <w:rStyle w:val="VerbatimChar"/>
-              </w:rPr>
-              <w:t xml:space="preserve">UNICA</w:t>
-            </w:r>
-            <w:r>
-              <w:t xml:space="preserve">,</w:t>
-            </w:r>
-            <w:r>
-              <w:t xml:space="preserve"> </w:t>
-            </w:r>
-            <w:r>
-              <w:rPr>
-                <w:rStyle w:val="VerbatimChar"/>
-              </w:rPr>
-              <w:t xml:space="preserve">NOCTURNA</w:t>
-            </w:r>
-            <w:r>
-              <w:t xml:space="preserve">).</w:t>
+              <w:t xml:space="preserve">)</w:t>
             </w:r>
           </w:p>
         </w:tc>
       </w:tr>
       <w:tr>
-        <w:tc>
-          <w:tcPr/>
-          <w:p>
-            <w:pPr>
-              <w:pStyle w:val="Compact"/>
-            </w:pPr>
-            <w:r>
-              <w:rPr>
-                <w:b/>
-                <w:bCs/>
-              </w:rPr>
-              <w:t xml:space="preserve">Eliminar Jornada</w:t>
-            </w:r>
-          </w:p>
-        </w:tc>
         <w:tc>
           <w:tcPr/>
           <w:p>
@@ -620,38 +767,21 @@
               <w:pStyle w:val="Compact"/>
             </w:pPr>
             <w:r>
-              <w:t xml:space="preserve">Directivo</w:t>
+              <w:t xml:space="preserve">Eliminar jornada libre de cursos (</w:t>
             </w:r>
-          </w:p>
-        </w:tc>
-        <w:tc>
-          <w:tcPr/>
-          <w:p>
-            <w:pPr>
-              <w:pStyle w:val="Compact"/>
-            </w:pPr>
             <w:r>
-              <w:t xml:space="preserve">Retira una jornada del colegio (solo si no tiene cursos o grupos vinculados).</w:t>
+              <w:rPr>
+                <w:rStyle w:val="VerbatimChar"/>
+              </w:rPr>
+              <w:t xml:space="preserve">deleteJornada</w:t>
+            </w:r>
+            <w:r>
+              <w:t xml:space="preserve">)</w:t>
             </w:r>
           </w:p>
         </w:tc>
       </w:tr>
       <w:tr>
-        <w:tc>
-          <w:tcPr/>
-          <w:p>
-            <w:pPr>
-              <w:pStyle w:val="Compact"/>
-            </w:pPr>
-            <w:r>
-              <w:rPr>
-                <w:b/>
-                <w:bCs/>
-              </w:rPr>
-              <w:t xml:space="preserve">Reasignar Curso de Jornada</w:t>
-            </w:r>
-          </w:p>
-        </w:tc>
         <w:tc>
           <w:tcPr/>
           <w:p>
@@ -687,699 +817,23 @@
               <w:pStyle w:val="Compact"/>
             </w:pPr>
             <w:r>
-              <w:t xml:space="preserve">Directivo</w:t>
+              <w:t xml:space="preserve">Reasignar curso a otra jornada (</w:t>
             </w:r>
-          </w:p>
-        </w:tc>
-        <w:tc>
-          <w:tcPr/>
-          <w:p>
-            <w:pPr>
-              <w:pStyle w:val="Compact"/>
-            </w:pPr>
             <w:r>
               <w:rPr>
-                <w:i/>
-                <w:iCs/>
+                <w:rStyle w:val="VerbatimChar"/>
               </w:rPr>
-              <w:t xml:space="preserve">(Temporalmente Restringido)</w:t>
+              <w:t xml:space="preserve">reassignGroupJornada</w:t>
             </w:r>
             <w:r>
-              <w:t xml:space="preserve"> </w:t>
-            </w:r>
-            <w:r>
-              <w:t xml:space="preserve">Operación protegida por política de matrículas.</w:t>
+              <w:t xml:space="preserve">)</w:t>
             </w:r>
           </w:p>
         </w:tc>
       </w:tr>
     </w:tbl>
-    <w:p>
-      <w:r>
-        <w:pict>
-          <v:rect style="width:0;height:1.5pt" o:hralign="center" o:hrstd="t" o:hr="t"/>
-        </w:pict>
-      </w:r>
-    </w:p>
-    <w:bookmarkEnd w:id="11"/>
-    <w:bookmarkStart w:id="12" w:name="reglas-de-negocio-específicas"/>
-    <w:p>
-      <w:pPr>
-        <w:pStyle w:val="Heading2"/>
-      </w:pPr>
-      <w:r>
-        <w:t xml:space="preserve">4. Reglas de Negocio Específicas</w:t>
-      </w:r>
-    </w:p>
-    <w:p>
-      <w:pPr>
-        <w:pStyle w:val="Compact"/>
-        <w:numPr>
-          <w:ilvl w:val="0"/>
-          <w:numId w:val="1001"/>
-        </w:numPr>
-      </w:pPr>
-      <w:r>
-        <w:rPr>
-          <w:b/>
-          <w:bCs/>
-        </w:rPr>
-        <w:t xml:space="preserve">RN-JOR-001 (Jornadas Institucionales Válidas):</w:t>
-      </w:r>
-      <w:r>
-        <w:t xml:space="preserve"> </w:t>
-      </w:r>
-      <w:r>
-        <w:t xml:space="preserve">Los nombres permitidos para las jornadas académicas en el sistema corresponden al estándar normativo del Ministerio de Educación:</w:t>
-      </w:r>
-      <w:r>
-        <w:t xml:space="preserve"> </w:t>
-      </w:r>
-      <w:r>
-        <w:rPr>
-          <w:rStyle w:val="VerbatimChar"/>
-        </w:rPr>
-        <w:t xml:space="preserve">MAÑANA</w:t>
-      </w:r>
-      <w:r>
-        <w:t xml:space="preserve">,</w:t>
-      </w:r>
-      <w:r>
-        <w:t xml:space="preserve"> </w:t>
-      </w:r>
-      <w:r>
-        <w:rPr>
-          <w:rStyle w:val="VerbatimChar"/>
-        </w:rPr>
-        <w:t xml:space="preserve">TARDE</w:t>
-      </w:r>
-      <w:r>
-        <w:t xml:space="preserve">,</w:t>
-      </w:r>
-      <w:r>
-        <w:t xml:space="preserve"> </w:t>
-      </w:r>
-      <w:r>
-        <w:rPr>
-          <w:rStyle w:val="VerbatimChar"/>
-        </w:rPr>
-        <w:t xml:space="preserve">UNICA</w:t>
-      </w:r>
-      <w:r>
-        <w:t xml:space="preserve"> </w:t>
-      </w:r>
-      <w:r>
-        <w:t xml:space="preserve">y</w:t>
-      </w:r>
-      <w:r>
-        <w:t xml:space="preserve"> </w:t>
-      </w:r>
-      <w:r>
-        <w:rPr>
-          <w:rStyle w:val="VerbatimChar"/>
-        </w:rPr>
-        <w:t xml:space="preserve">NOCTURNA</w:t>
-      </w:r>
-      <w:r>
-        <w:t xml:space="preserve">.</w:t>
-      </w:r>
-    </w:p>
-    <w:p>
-      <w:pPr>
-        <w:pStyle w:val="Compact"/>
-        <w:numPr>
-          <w:ilvl w:val="0"/>
-          <w:numId w:val="1001"/>
-        </w:numPr>
-      </w:pPr>
-      <w:r>
-        <w:rPr>
-          <w:b/>
-          <w:bCs/>
-        </w:rPr>
-        <w:t xml:space="preserve">RN-JOR-002 (Unicidad por Colegio):</w:t>
-      </w:r>
-      <w:r>
-        <w:t xml:space="preserve"> </w:t>
-      </w:r>
-      <w:r>
-        <w:t xml:space="preserve">No se permiten jornadas duplicadas con el mismo nombre dentro de una misma institución educativa (</w:t>
-      </w:r>
-      <w:r>
-        <w:rPr>
-          <w:rStyle w:val="VerbatimChar"/>
-        </w:rPr>
-        <w:t xml:space="preserve">UNIQUE(id_colegio, nombre)</w:t>
-      </w:r>
-      <w:r>
-        <w:t xml:space="preserve">).</w:t>
-      </w:r>
-    </w:p>
-    <w:p>
-      <w:pPr>
-        <w:pStyle w:val="Compact"/>
-        <w:numPr>
-          <w:ilvl w:val="0"/>
-          <w:numId w:val="1001"/>
-        </w:numPr>
-      </w:pPr>
-      <w:r>
-        <w:rPr>
-          <w:b/>
-          <w:bCs/>
-        </w:rPr>
-        <w:t xml:space="preserve">RN-JOR-003 (Protección contra Supresión con Dependencias):</w:t>
-      </w:r>
-      <w:r>
-        <w:t xml:space="preserve"> </w:t>
-      </w:r>
-      <w:r>
-        <w:t xml:space="preserve">Una jornada no puede eliminarse si tiene uno o más cursos/grupos asociados. El directivo debe reasignar o eliminar los cursos antes de poder retirar la jornada.</w:t>
-      </w:r>
-    </w:p>
-    <w:p>
-      <w:pPr>
-        <w:pStyle w:val="Compact"/>
-        <w:numPr>
-          <w:ilvl w:val="0"/>
-          <w:numId w:val="1001"/>
-        </w:numPr>
-      </w:pPr>
-      <w:r>
-        <w:rPr>
-          <w:b/>
-          <w:bCs/>
-        </w:rPr>
-        <w:t xml:space="preserve">RN-JOR-004 (Validación de Conflicto en Reasignación):</w:t>
-      </w:r>
-      <w:r>
-        <w:t xml:space="preserve"> </w:t>
-      </w:r>
-      <w:r>
-        <w:t xml:space="preserve">Al reasignar un curso a otra jornada, el sistema verifica que no exista previamente un curso con el mismo grado y sección en la jornada de destino (evitando duplicidades de salón como dos</w:t>
-      </w:r>
-      <w:r>
-        <w:t xml:space="preserve"> </w:t>
-      </w:r>
-      <w:r>
-        <w:t xml:space="preserve">“Primero A”</w:t>
-      </w:r>
-      <w:r>
-        <w:t xml:space="preserve"> </w:t>
-      </w:r>
-      <w:r>
-        <w:t xml:space="preserve">en la Tarde).</w:t>
-      </w:r>
-    </w:p>
-    <w:p>
-      <w:pPr>
-        <w:pStyle w:val="Compact"/>
-        <w:numPr>
-          <w:ilvl w:val="0"/>
-          <w:numId w:val="1001"/>
-        </w:numPr>
-      </w:pPr>
-      <w:r>
-        <w:rPr>
-          <w:b/>
-          <w:bCs/>
-        </w:rPr>
-        <w:t xml:space="preserve">RN-JOR-005 (Preservación de Matrículas e Integrantes):</w:t>
-      </w:r>
-      <w:r>
-        <w:t xml:space="preserve"> </w:t>
-      </w:r>
-      <w:r>
-        <w:t xml:space="preserve">La reasignación de jornada modifica el atributo</w:t>
-      </w:r>
-      <w:r>
-        <w:t xml:space="preserve"> </w:t>
-      </w:r>
-      <w:r>
-        <w:rPr>
-          <w:rStyle w:val="VerbatimChar"/>
-        </w:rPr>
-        <w:t xml:space="preserve">id_jornada</w:t>
-      </w:r>
-      <w:r>
-        <w:t xml:space="preserve"> </w:t>
-      </w:r>
-      <w:r>
-        <w:t xml:space="preserve">en la entidad</w:t>
-      </w:r>
-      <w:r>
-        <w:t xml:space="preserve"> </w:t>
-      </w:r>
-      <w:r>
-        <w:rPr>
-          <w:rStyle w:val="VerbatimChar"/>
-        </w:rPr>
-        <w:t xml:space="preserve">grupos</w:t>
-      </w:r>
-      <w:r>
-        <w:t xml:space="preserve">, manteniendo intactas las matrículas de los estudiantes, asignaciones de docentes y notas registradas.</w:t>
-      </w:r>
-    </w:p>
-    <w:p>
-      <w:pPr>
-        <w:pStyle w:val="Compact"/>
-        <w:numPr>
-          <w:ilvl w:val="0"/>
-          <w:numId w:val="1001"/>
-        </w:numPr>
-      </w:pPr>
-      <w:r>
-        <w:rPr>
-          <w:b/>
-          <w:bCs/>
-        </w:rPr>
-        <w:t xml:space="preserve">RN-JOR-006 (Restricción por Cierre de Año):</w:t>
-      </w:r>
-      <w:r>
-        <w:t xml:space="preserve"> </w:t>
-      </w:r>
-      <w:r>
-        <w:t xml:space="preserve">Si el año lectivo se encuentra en estado</w:t>
-      </w:r>
-      <w:r>
-        <w:t xml:space="preserve"> </w:t>
-      </w:r>
-      <w:r>
-        <w:rPr>
-          <w:rStyle w:val="VerbatimChar"/>
-        </w:rPr>
-        <w:t xml:space="preserve">CERRADO</w:t>
-      </w:r>
-      <w:r>
-        <w:t xml:space="preserve">, la sub-vista de jornadas se activa en modo de solo lectura (consulta histórica de aforos sin permisos de creación, eliminación ni reasignación).</w:t>
-      </w:r>
-    </w:p>
-    <w:p>
-      <w:pPr>
-        <w:pStyle w:val="Compact"/>
-        <w:numPr>
-          <w:ilvl w:val="0"/>
-          <w:numId w:val="1001"/>
-        </w:numPr>
-      </w:pPr>
-      <w:r>
-        <w:rPr>
-          <w:b/>
-          <w:bCs/>
-        </w:rPr>
-        <w:t xml:space="preserve">RN-JOR-007 (Bloqueo Preventivo de Reasignación de Jornada):</w:t>
-      </w:r>
-      <w:r>
-        <w:t xml:space="preserve"> </w:t>
-      </w:r>
-      <w:r>
-        <w:t xml:space="preserve">Debido a que la jornada es una preferencia contractualmente acordada por acudientes y padres de familia durante el proceso de admisión y matrícula, la acción de reasignación masiva de curso se mantiene estática e inactiva para evitar alteraciones no consensuadas en los horarios familiares.</w:t>
-      </w:r>
-    </w:p>
-    <w:p>
-      <w:r>
-        <w:pict>
-          <v:rect style="width:0;height:1.5pt" o:hralign="center" o:hrstd="t" o:hr="t"/>
-        </w:pict>
-      </w:r>
-    </w:p>
-    <w:bookmarkEnd w:id="12"/>
-    <w:bookmarkStart w:id="13" w:name="métricas-y-kpis-de-la-sub-vista"/>
-    <w:p>
-      <w:pPr>
-        <w:pStyle w:val="Heading2"/>
-      </w:pPr>
-      <w:r>
-        <w:t xml:space="preserve">5. Métricas y KPIs de la Sub-Vista</w:t>
-      </w:r>
-    </w:p>
-    <w:p>
-      <w:pPr>
-        <w:pStyle w:val="Compact"/>
-        <w:numPr>
-          <w:ilvl w:val="0"/>
-          <w:numId w:val="1002"/>
-        </w:numPr>
-      </w:pPr>
-      <w:r>
-        <w:rPr>
-          <w:b/>
-          <w:bCs/>
-        </w:rPr>
-        <w:t xml:space="preserve">Jornadas Habilitadas:</w:t>
-      </w:r>
-      <w:r>
-        <w:t xml:space="preserve"> </w:t>
-      </w:r>
-      <w:r>
-        <w:t xml:space="preserve">Total de turnos activos en el colegio.</w:t>
-      </w:r>
-    </w:p>
-    <w:p>
-      <w:pPr>
-        <w:pStyle w:val="Compact"/>
-        <w:numPr>
-          <w:ilvl w:val="0"/>
-          <w:numId w:val="1002"/>
-        </w:numPr>
-      </w:pPr>
-      <w:r>
-        <w:rPr>
-          <w:b/>
-          <w:bCs/>
-        </w:rPr>
-        <w:t xml:space="preserve">Total Cursos / Salones:</w:t>
-      </w:r>
-      <w:r>
-        <w:t xml:space="preserve"> </w:t>
-      </w:r>
-      <w:r>
-        <w:t xml:space="preserve">Distribución y cantidad de grupos por jornada.</w:t>
-      </w:r>
-    </w:p>
-    <w:p>
-      <w:pPr>
-        <w:pStyle w:val="Compact"/>
-        <w:numPr>
-          <w:ilvl w:val="0"/>
-          <w:numId w:val="1002"/>
-        </w:numPr>
-      </w:pPr>
-      <w:r>
-        <w:rPr>
-          <w:b/>
-          <w:bCs/>
-        </w:rPr>
-        <w:t xml:space="preserve">Matrículas Activas vs. Cupos Totales:</w:t>
-      </w:r>
-      <w:r>
-        <w:t xml:space="preserve"> </w:t>
-      </w:r>
-      <w:r>
-        <w:t xml:space="preserve">Indicador de aforo y barra de progreso porcentual (</w:t>
-      </w:r>
-      <w:r>
-        <w:rPr>
-          <w:rStyle w:val="VerbatimChar"/>
-        </w:rPr>
-        <w:t xml:space="preserve">% de ocupación</w:t>
-      </w:r>
-      <w:r>
-        <w:t xml:space="preserve">) con alertas visuales:</w:t>
-      </w:r>
-    </w:p>
-    <w:p>
-      <w:pPr>
-        <w:pStyle w:val="Compact"/>
-        <w:numPr>
-          <w:ilvl w:val="1"/>
-          <w:numId w:val="1003"/>
-        </w:numPr>
-      </w:pPr>
-      <w:r>
-        <w:t xml:space="preserve">🟢</w:t>
-      </w:r>
-      <w:r>
-        <w:t xml:space="preserve"> </w:t>
-      </w:r>
-      <w:r>
-        <w:rPr>
-          <w:b/>
-          <w:bCs/>
-        </w:rPr>
-        <w:t xml:space="preserve">Ocupación Normal:</w:t>
-      </w:r>
-      <w:r>
-        <w:t xml:space="preserve"> </w:t>
-      </w:r>
-      <w:r>
-        <w:t xml:space="preserve">Menor al 80%.</w:t>
-      </w:r>
-    </w:p>
-    <w:p>
-      <w:pPr>
-        <w:pStyle w:val="Compact"/>
-        <w:numPr>
-          <w:ilvl w:val="1"/>
-          <w:numId w:val="1003"/>
-        </w:numPr>
-      </w:pPr>
-      <w:r>
-        <w:t xml:space="preserve">🟡</w:t>
-      </w:r>
-      <w:r>
-        <w:t xml:space="preserve"> </w:t>
-      </w:r>
-      <w:r>
-        <w:rPr>
-          <w:b/>
-          <w:bCs/>
-        </w:rPr>
-        <w:t xml:space="preserve">Alta Demanda:</w:t>
-      </w:r>
-      <w:r>
-        <w:t xml:space="preserve"> </w:t>
-      </w:r>
-      <w:r>
-        <w:t xml:space="preserve">Entre 80% y 99%.</w:t>
-      </w:r>
-    </w:p>
-    <w:p>
-      <w:pPr>
-        <w:pStyle w:val="Compact"/>
-        <w:numPr>
-          <w:ilvl w:val="1"/>
-          <w:numId w:val="1003"/>
-        </w:numPr>
-      </w:pPr>
-      <w:r>
-        <w:t xml:space="preserve">🔴</w:t>
-      </w:r>
-      <w:r>
-        <w:t xml:space="preserve"> </w:t>
-      </w:r>
-      <w:r>
-        <w:rPr>
-          <w:b/>
-          <w:bCs/>
-        </w:rPr>
-        <w:t xml:space="preserve">Aforo Completo (100%):</w:t>
-      </w:r>
-      <w:r>
-        <w:t xml:space="preserve"> </w:t>
-      </w:r>
-      <w:r>
-        <w:t xml:space="preserve">Sin cupos disponibles para nuevas inscripciones o traslados.</w:t>
-      </w:r>
-    </w:p>
-    <w:p>
-      <w:pPr>
-        <w:pStyle w:val="Compact"/>
-        <w:numPr>
-          <w:ilvl w:val="0"/>
-          <w:numId w:val="1002"/>
-        </w:numPr>
-      </w:pPr>
-      <w:r>
-        <w:rPr>
-          <w:b/>
-          <w:bCs/>
-        </w:rPr>
-        <w:t xml:space="preserve">Grados Operando:</w:t>
-      </w:r>
-      <w:r>
-        <w:t xml:space="preserve"> </w:t>
-      </w:r>
-      <w:r>
-        <w:t xml:space="preserve">Badges dinámicos que muestran la cobertura de niveles y grados en cada jornada.</w:t>
-      </w:r>
-    </w:p>
-    <w:p>
-      <w:r>
-        <w:pict>
-          <v:rect style="width:0;height:1.5pt" o:hralign="center" o:hrstd="t" o:hr="t"/>
-        </w:pict>
-      </w:r>
-    </w:p>
-    <w:bookmarkEnd w:id="13"/>
-    <w:bookmarkStart w:id="19" w:name="arquitectura-e-implementación"/>
-    <w:p>
-      <w:pPr>
-        <w:pStyle w:val="Heading2"/>
-      </w:pPr>
-      <w:r>
-        <w:t xml:space="preserve">6. Arquitectura e Implementación</w:t>
-      </w:r>
-    </w:p>
-    <w:bookmarkStart w:id="16" w:name="backend"/>
-    <w:p>
-      <w:pPr>
-        <w:pStyle w:val="Heading3"/>
-      </w:pPr>
-      <w:r>
-        <w:t xml:space="preserve">Backend</w:t>
-      </w:r>
-    </w:p>
-    <w:p>
-      <w:pPr>
-        <w:pStyle w:val="Compact"/>
-        <w:numPr>
-          <w:ilvl w:val="0"/>
-          <w:numId w:val="1004"/>
-        </w:numPr>
-      </w:pPr>
-      <w:r>
-        <w:rPr>
-          <w:b/>
-          <w:bCs/>
-        </w:rPr>
-        <w:t xml:space="preserve">Controlador:</w:t>
-      </w:r>
-      <w:r>
-        <w:t xml:space="preserve"> </w:t>
-      </w:r>
-      <w:hyperlink r:id="rId14">
-        <w:r>
-          <w:rPr>
-            <w:rStyle w:val="Hyperlink"/>
-          </w:rPr>
-          <w:t xml:space="preserve">gradeGroupController.ts</w:t>
-        </w:r>
-      </w:hyperlink>
-      <w:r>
-        <w:t xml:space="preserve"> </w:t>
-      </w:r>
-      <w:r>
-        <w:t xml:space="preserve">(</w:t>
-      </w:r>
-      <w:r>
-        <w:rPr>
-          <w:rStyle w:val="VerbatimChar"/>
-        </w:rPr>
-        <w:t xml:space="preserve">createJornada</w:t>
-      </w:r>
-      <w:r>
-        <w:t xml:space="preserve">,</w:t>
-      </w:r>
-      <w:r>
-        <w:t xml:space="preserve"> </w:t>
-      </w:r>
-      <w:r>
-        <w:rPr>
-          <w:rStyle w:val="VerbatimChar"/>
-        </w:rPr>
-        <w:t xml:space="preserve">deleteJornada</w:t>
-      </w:r>
-      <w:r>
-        <w:t xml:space="preserve">,</w:t>
-      </w:r>
-      <w:r>
-        <w:t xml:space="preserve"> </w:t>
-      </w:r>
-      <w:r>
-        <w:rPr>
-          <w:rStyle w:val="VerbatimChar"/>
-        </w:rPr>
-        <w:t xml:space="preserve">reassignGroupJornada</w:t>
-      </w:r>
-      <w:r>
-        <w:t xml:space="preserve"> </w:t>
-      </w:r>
-      <w:r>
-        <w:t xml:space="preserve">con Kysely QueryBuilder).</w:t>
-      </w:r>
-    </w:p>
-    <w:p>
-      <w:pPr>
-        <w:pStyle w:val="Compact"/>
-        <w:numPr>
-          <w:ilvl w:val="0"/>
-          <w:numId w:val="1004"/>
-        </w:numPr>
-      </w:pPr>
-      <w:r>
-        <w:rPr>
-          <w:b/>
-          <w:bCs/>
-        </w:rPr>
-        <w:t xml:space="preserve">Rutas:</w:t>
-      </w:r>
-      <w:r>
-        <w:t xml:space="preserve"> </w:t>
-      </w:r>
-      <w:hyperlink r:id="rId15">
-        <w:r>
-          <w:rPr>
-            <w:rStyle w:val="Hyperlink"/>
-          </w:rPr>
-          <w:t xml:space="preserve">academicAdmin.routes.ts</w:t>
-        </w:r>
-      </w:hyperlink>
-      <w:r>
-        <w:t xml:space="preserve">.</w:t>
-      </w:r>
-    </w:p>
-    <w:bookmarkEnd w:id="16"/>
-    <w:bookmarkStart w:id="18" w:name="frontend"/>
-    <w:p>
-      <w:pPr>
-        <w:pStyle w:val="Heading3"/>
-      </w:pPr>
-      <w:r>
-        <w:t xml:space="preserve">Frontend</w:t>
-      </w:r>
-    </w:p>
-    <w:p>
-      <w:pPr>
-        <w:pStyle w:val="Compact"/>
-        <w:numPr>
-          <w:ilvl w:val="0"/>
-          <w:numId w:val="1005"/>
-        </w:numPr>
-      </w:pPr>
-      <w:r>
-        <w:rPr>
-          <w:b/>
-          <w:bCs/>
-        </w:rPr>
-        <w:t xml:space="preserve">Vista Principal:</w:t>
-      </w:r>
-      <w:r>
-        <w:t xml:space="preserve"> </w:t>
-      </w:r>
-      <w:hyperlink r:id="rId17">
-        <w:r>
-          <w:rPr>
-            <w:rStyle w:val="Hyperlink"/>
-          </w:rPr>
-          <w:t xml:space="preserve">GradeManagement.vue</w:t>
-        </w:r>
-      </w:hyperlink>
-      <w:r>
-        <w:t xml:space="preserve"> </w:t>
-      </w:r>
-      <w:r>
-        <w:t xml:space="preserve">— Pestaña interactiva</w:t>
-      </w:r>
-      <w:r>
-        <w:t xml:space="preserve"> </w:t>
-      </w:r>
-      <w:r>
-        <w:rPr>
-          <w:rStyle w:val="VerbatimChar"/>
-        </w:rPr>
-        <w:t xml:space="preserve">Gestión de Jornadas</w:t>
-      </w:r>
-      <w:r>
-        <w:t xml:space="preserve"> </w:t>
-      </w:r>
-      <w:r>
-        <w:t xml:space="preserve">con selector de sub-navegación, tarjetas de estadísticas por turno, explorador de cursos y modales de gestión.</w:t>
-      </w:r>
-    </w:p>
+    <w:bookmarkEnd w:id="17"/>
     <w:bookmarkEnd w:id="18"/>
-    <w:bookmarkEnd w:id="19"/>
-    <w:bookmarkEnd w:id="20"/>
     <w:sectPr>
       <w:footnotePr>
         <w:numRestart w:val="eachSect"/>
@@ -1593,91 +1047,6 @@
       </w:rPr>
     </w:lvl>
   </w:abstractNum>
-  <w:abstractNum w:abstractNumId="99411">
-    <w:nsid w:val="00A99411"/>
-    <w:multiLevelType w:val="multilevel"/>
-    <w:lvl w:ilvl="0">
-      <w:start w:val="1"/>
-      <w:numFmt w:val="decimal"/>
-      <w:lvlText w:val="%1."/>
-      <w:lvlJc w:val="left"/>
-      <w:pPr>
-        <w:ind w:left="720" w:hanging="360"/>
-      </w:pPr>
-    </w:lvl>
-    <w:lvl w:ilvl="1">
-      <w:start w:val="1"/>
-      <w:numFmt w:val="decimal"/>
-      <w:lvlText w:val="%2."/>
-      <w:lvlJc w:val="left"/>
-      <w:pPr>
-        <w:ind w:left="1440" w:hanging="360"/>
-      </w:pPr>
-    </w:lvl>
-    <w:lvl w:ilvl="2">
-      <w:start w:val="1"/>
-      <w:numFmt w:val="decimal"/>
-      <w:lvlText w:val="%3."/>
-      <w:lvlJc w:val="left"/>
-      <w:pPr>
-        <w:ind w:left="2160" w:hanging="360"/>
-      </w:pPr>
-    </w:lvl>
-    <w:lvl w:ilvl="3">
-      <w:start w:val="1"/>
-      <w:numFmt w:val="decimal"/>
-      <w:lvlText w:val="%4."/>
-      <w:lvlJc w:val="left"/>
-      <w:pPr>
-        <w:ind w:left="2880" w:hanging="360"/>
-      </w:pPr>
-    </w:lvl>
-    <w:lvl w:ilvl="4">
-      <w:start w:val="1"/>
-      <w:numFmt w:val="decimal"/>
-      <w:lvlText w:val="%5."/>
-      <w:lvlJc w:val="left"/>
-      <w:pPr>
-        <w:ind w:left="3600" w:hanging="360"/>
-      </w:pPr>
-    </w:lvl>
-    <w:lvl w:ilvl="5">
-      <w:start w:val="1"/>
-      <w:numFmt w:val="decimal"/>
-      <w:lvlText w:val="%6."/>
-      <w:lvlJc w:val="left"/>
-      <w:pPr>
-        <w:ind w:left="4320" w:hanging="360"/>
-      </w:pPr>
-    </w:lvl>
-    <w:lvl w:ilvl="6">
-      <w:start w:val="1"/>
-      <w:numFmt w:val="decimal"/>
-      <w:lvlText w:val="%7."/>
-      <w:lvlJc w:val="left"/>
-      <w:pPr>
-        <w:ind w:left="5040" w:hanging="360"/>
-      </w:pPr>
-    </w:lvl>
-    <w:lvl w:ilvl="7">
-      <w:start w:val="1"/>
-      <w:numFmt w:val="decimal"/>
-      <w:lvlText w:val="%8."/>
-      <w:lvlJc w:val="left"/>
-      <w:pPr>
-        <w:ind w:left="5760" w:hanging="360"/>
-      </w:pPr>
-    </w:lvl>
-    <w:lvl w:ilvl="8">
-      <w:start w:val="1"/>
-      <w:numFmt w:val="decimal"/>
-      <w:lvlText w:val="%9."/>
-      <w:lvlJc w:val="left"/>
-      <w:pPr>
-        <w:ind w:left="6480" w:hanging="360"/>
-      </w:pPr>
-    </w:lvl>
-  </w:abstractNum>
   <w:num w:numId="1000">
     <w:abstractNumId w:val="990"/>
   </w:num>
@@ -1685,42 +1054,12 @@
     <w:abstractNumId w:val="991"/>
   </w:num>
   <w:num w:numId="1002">
-    <w:abstractNumId w:val="99411"/>
-    <w:lvlOverride w:ilvl="0">
-      <w:startOverride w:val="1"/>
-    </w:lvlOverride>
-    <w:lvlOverride w:ilvl="1">
-      <w:startOverride w:val="1"/>
-    </w:lvlOverride>
-    <w:lvlOverride w:ilvl="2">
-      <w:startOverride w:val="1"/>
-    </w:lvlOverride>
-    <w:lvlOverride w:ilvl="3">
-      <w:startOverride w:val="1"/>
-    </w:lvlOverride>
-    <w:lvlOverride w:ilvl="4">
-      <w:startOverride w:val="1"/>
-    </w:lvlOverride>
-    <w:lvlOverride w:ilvl="5">
-      <w:startOverride w:val="1"/>
-    </w:lvlOverride>
-    <w:lvlOverride w:ilvl="6">
-      <w:startOverride w:val="1"/>
-    </w:lvlOverride>
-    <w:lvlOverride w:ilvl="7">
-      <w:startOverride w:val="1"/>
-    </w:lvlOverride>
-    <w:lvlOverride w:ilvl="8">
-      <w:startOverride w:val="1"/>
-    </w:lvlOverride>
+    <w:abstractNumId w:val="991"/>
   </w:num>
   <w:num w:numId="1003">
     <w:abstractNumId w:val="991"/>
   </w:num>
   <w:num w:numId="1004">
-    <w:abstractNumId w:val="991"/>
-  </w:num>
-  <w:num w:numId="1005">
     <w:abstractNumId w:val="991"/>
   </w:num>
 </w:numbering>

</xml_diff>